<commit_message>
the dropdown menu has been fixied.
</commit_message>
<xml_diff>
--- a/app/templates/docx/student-registration-form.docx
+++ b/app/templates/docx/student-registration-form.docx
@@ -247,18 +247,7 @@
           <w:szCs w:val="14"/>
           <w:lang w:bidi="fa-IR"/>
         </w:rPr>
-        <w:t>form_</w:t>
-      </w:r>
-      <w:r>
-        <w:rPr>
-          <w:rFonts w:cs="B Nazanin" w:asciiTheme="majorBidi" w:hAnsiTheme="majorBidi"/>
-          <w:b/>
-          <w:bCs/>
-          <w:sz w:val="14"/>
-          <w:szCs w:val="14"/>
-          <w:lang w:bidi="fa-IR"/>
-        </w:rPr>
-        <w:t>number</w:t>
+        <w:t>form_number</w:t>
       </w:r>
       <w:r>
         <w:rPr>
@@ -11946,7 +11935,7 @@
                 <w:szCs w:val="12"/>
                 <w:lang w:val="en-US" w:eastAsia="en-US" w:bidi="fa-IR"/>
               </w:rPr>
-              <w:t>{{GRADE_S_000003_SUM}}</w:t>
+              <w:t>{{SUM_GRADE_S_000003}}</w:t>
             </w:r>
           </w:p>
         </w:tc>
@@ -12076,7 +12065,7 @@
                 <w:szCs w:val="12"/>
                 <w:lang w:val="en-US" w:eastAsia="en-US" w:bidi="fa-IR"/>
               </w:rPr>
-              <w:t>{{GRADE_S_000002_SUM}}</w:t>
+              <w:t>{{SUM_GRADE_S_000002}}</w:t>
             </w:r>
           </w:p>
         </w:tc>
@@ -12205,7 +12194,7 @@
                 <w:szCs w:val="12"/>
                 <w:lang w:val="en-US" w:eastAsia="en-US" w:bidi="fa-IR"/>
               </w:rPr>
-              <w:t>{{GRADE_S_000001_SUM}}</w:t>
+              <w:t>{{SUM_GRADE_S_000001}}</w:t>
             </w:r>
           </w:p>
         </w:tc>
@@ -12454,7 +12443,7 @@
                 <w:szCs w:val="12"/>
                 <w:lang w:val="en-US" w:eastAsia="en-US" w:bidi="fa-IR"/>
               </w:rPr>
-              <w:t>{{GRADE_S_000003_AVG}}%</w:t>
+              <w:t>{{AVG_GRADE_S_000003}}%</w:t>
             </w:r>
           </w:p>
         </w:tc>
@@ -12584,7 +12573,7 @@
                 <w:szCs w:val="12"/>
                 <w:lang w:val="en-US" w:eastAsia="en-US" w:bidi="fa-IR"/>
               </w:rPr>
-              <w:t>{{GRADE_S_000002_AVG}}%</w:t>
+              <w:t>{{AVG_GRADE_S_000002}}%</w:t>
             </w:r>
           </w:p>
         </w:tc>
@@ -12713,7 +12702,7 @@
                 <w:szCs w:val="12"/>
                 <w:lang w:val="en-US" w:eastAsia="en-US" w:bidi="fa-IR"/>
               </w:rPr>
-              <w:t>{{GRADE_S_000001_AVG}}%</w:t>
+              <w:t>{{AVG_GRADE_S_000001}}%</w:t>
             </w:r>
           </w:p>
         </w:tc>
@@ -13092,11 +13081,11 @@
           <wp:effectExtent l="0" t="0" r="0" b="0"/>
           <wp:wrapThrough wrapText="bothSides">
             <wp:wrapPolygon edited="0">
-              <wp:start x="-117" y="0"/>
-              <wp:lineTo x="-117" y="20952"/>
-              <wp:lineTo x="20956" y="20952"/>
-              <wp:lineTo x="20956" y="0"/>
-              <wp:lineTo x="-117" y="0"/>
+              <wp:start x="-140" y="0"/>
+              <wp:lineTo x="-140" y="20930"/>
+              <wp:lineTo x="20932" y="20930"/>
+              <wp:lineTo x="20932" y="0"/>
+              <wp:lineTo x="-140" y="0"/>
             </wp:wrapPolygon>
           </wp:wrapThrough>
           <wp:docPr id="3" name="Picture 1" descr=""/>
@@ -13145,11 +13134,11 @@
           <wp:effectExtent l="0" t="0" r="0" b="0"/>
           <wp:wrapThrough wrapText="bothSides">
             <wp:wrapPolygon edited="0">
-              <wp:start x="-109" y="0"/>
-              <wp:lineTo x="-109" y="20859"/>
-              <wp:lineTo x="20949" y="20859"/>
-              <wp:lineTo x="20949" y="0"/>
-              <wp:lineTo x="-109" y="0"/>
+              <wp:start x="-132" y="0"/>
+              <wp:lineTo x="-132" y="20834"/>
+              <wp:lineTo x="20928" y="20834"/>
+              <wp:lineTo x="20928" y="0"/>
+              <wp:lineTo x="-132" y="0"/>
             </wp:wrapPolygon>
           </wp:wrapThrough>
           <wp:docPr id="4" name="Picture 13" descr="D:\اسنادهای 1400\مکتوب جدید1400\FB_IMG_16057936778036117.jpg"/>
@@ -13466,11 +13455,11 @@
           <wp:effectExtent l="0" t="0" r="0" b="0"/>
           <wp:wrapThrough wrapText="bothSides">
             <wp:wrapPolygon edited="0">
-              <wp:start x="-117" y="0"/>
-              <wp:lineTo x="-117" y="20952"/>
-              <wp:lineTo x="20956" y="20952"/>
-              <wp:lineTo x="20956" y="0"/>
-              <wp:lineTo x="-117" y="0"/>
+              <wp:start x="-140" y="0"/>
+              <wp:lineTo x="-140" y="20930"/>
+              <wp:lineTo x="20932" y="20930"/>
+              <wp:lineTo x="20932" y="0"/>
+              <wp:lineTo x="-140" y="0"/>
             </wp:wrapPolygon>
           </wp:wrapThrough>
           <wp:docPr id="6" name="Picture 1" descr=""/>
@@ -13519,11 +13508,11 @@
           <wp:effectExtent l="0" t="0" r="0" b="0"/>
           <wp:wrapThrough wrapText="bothSides">
             <wp:wrapPolygon edited="0">
-              <wp:start x="-109" y="0"/>
-              <wp:lineTo x="-109" y="20859"/>
-              <wp:lineTo x="20949" y="20859"/>
-              <wp:lineTo x="20949" y="0"/>
-              <wp:lineTo x="-109" y="0"/>
+              <wp:start x="-132" y="0"/>
+              <wp:lineTo x="-132" y="20834"/>
+              <wp:lineTo x="20928" y="20834"/>
+              <wp:lineTo x="20928" y="0"/>
+              <wp:lineTo x="-132" y="0"/>
             </wp:wrapPolygon>
           </wp:wrapThrough>
           <wp:docPr id="7" name="Picture 13" descr="D:\اسنادهای 1400\مکتوب جدید1400\FB_IMG_16057936778036117.jpg"/>

</xml_diff>